<commit_message>
Correct pre-release documents, source validation and public provenance
Synchronise manuscript formats and figures, strengthen reproducibility checks,
clarify third-party source coverage and licensing, and remove private-source
filenames and checksums from current public provenance.

All 36 tests pass; numerical catalogue CSVs are unchanged.
No release tag or Zenodo publication is included.
</commit_message>
<xml_diff>
--- a/output/Prime_Gap_Ruptures.docx
+++ b/output/Prime_Gap_Ruptures.docx
@@ -2127,7 +2127,7 @@
     </w:p>
     <w:p>
       <w:r>
-        <w:t>For each skipped step t in Kₙ, let F(t) be the lower endpoint of the first consecutive-prime gap of size 2t. Its recovery pair is F(t)→F(t)+2t. This occurrence must be later than the rupture, because t exceeded every earlier step. Complete recovery is observed at the upper endpoint of the last such pair. We also report that pair's lower endpoint as complete_p. No recovery date is assigned until both endpoints lie within the observation boundary.</w:t>
+        <w:t>For each skipped step t in Kₙ, let F(t) be the lower endpoint of the first consecutive-prime gap of size 2t, if such a gap exists. Its recovery pair is F(t)→F(t)+2t. This occurrence must be later than the rupture, because t exceeded every earlier step. Complete recovery is observed at the upper endpoint of the last such pair. We also report that pair's lower endpoint as complete_p. No recovery date is assigned until both endpoints lie within the observation boundary.</w:t>
       </w:r>
     </w:p>
     <w:p>
@@ -2488,7 +2488,7 @@
     </w:p>
     <w:p>
       <w:r>
-        <w:t>The final numerical run used Python 3.12.14 on Linux-6.18.44-x86_64-with-glibc2.39 (x86_64). It took 9.62 seconds and approximately 13.3 MiB peak resident memory. This is a single-process CPU computation, excluding downloads, spreadsheet extraction, figures and document rendering. No specialised hardware or GPU is required; wall time varies by machine.</w:t>
+        <w:t>The final numerical run used Python 3.12.14 on Linux-6.18.44-x86_64-with-glibc2.39 (x86_64). It took 4.18 seconds, with approximately 13.4 MiB peak resident memory. This is a single-process CPU computation, excluding downloads, spreadsheet extraction, figures and document rendering. No specialised hardware or GPU is required; wall time varies by machine.</w:t>
       </w:r>
     </w:p>
     <w:p>
@@ -6412,7 +6412,7 @@
     </w:p>
     <w:p>
       <w:r>
-        <w:t>[2] Prime Gap List Project. Exhaustively analyzed gaps. Accessed 13 September 2026. https://primegap-list-project.github.io/fully-analyzed/</w:t>
+        <w:t>[2] Prime Gap List Project. Exhaustively analyzed gaps. Accessed 13 September 2026; boundary rechecked 14 September 2026. https://primegap-list-project.github.io/fully-analyzed/</w:t>
       </w:r>
     </w:p>
     <w:p>
@@ -6422,7 +6422,7 @@
     </w:p>
     <w:p>
       <w:r>
-        <w:t>[4] OEIS Foundation. A000230, smallest lower prime for each even gap. B-file through step 721, accessed 13 September 2026. https://oeis.org/A000230</w:t>
+        <w:t>[4] OEIS Foundation. A000230, smallest lower prime for each even gap. B-file through step 721, refreshed 14 September 2026. https://oeis.org/A000230</w:t>
       </w:r>
     </w:p>
     <w:p>
@@ -12839,161 +12839,6 @@
           </w:p>
         </w:tc>
       </w:tr>
-    </w:tbl>
-    <w:p/>
-    <w:p>
-      <w:r>
-        <w:br w:type="page"/>
-      </w:r>
-    </w:p>
-    <w:tbl>
-      <w:tblPr>
-        <w:tblStyle w:val="TableGrid"/>
-        <w:tblW w:type="auto" w:w="0"/>
-        <w:tblLayout w:type="fixed"/>
-        <w:tblLook w:firstColumn="1" w:firstRow="1" w:lastColumn="0" w:lastRow="0" w:noHBand="0" w:noVBand="1" w:val="04A0"/>
-      </w:tblPr>
-      <w:tblGrid>
-        <w:gridCol w:w="504"/>
-        <w:gridCol w:w="3528"/>
-        <w:gridCol w:w="720"/>
-        <w:gridCol w:w="720"/>
-        <w:gridCol w:w="720"/>
-        <w:gridCol w:w="1512"/>
-        <w:gridCol w:w="936"/>
-      </w:tblGrid>
-      <w:tr>
-        <w:trPr>
-          <w:cantSplit/>
-          <w:tblHeader/>
-        </w:trPr>
-        <w:tc>
-          <w:tcPr>
-            <w:tcW w:type="dxa" w:w="504"/>
-            <w:shd w:fill="E6E6E6"/>
-          </w:tcPr>
-          <w:p>
-            <w:pPr>
-              <w:spacing w:after="60" w:before="60"/>
-            </w:pPr>
-            <w:r>
-              <w:rPr>
-                <w:b/>
-                <w:sz w:val="18"/>
-              </w:rPr>
-              <w:t>No.</w:t>
-            </w:r>
-          </w:p>
-        </w:tc>
-        <w:tc>
-          <w:tcPr>
-            <w:tcW w:type="dxa" w:w="3528"/>
-            <w:shd w:fill="E6E6E6"/>
-          </w:tcPr>
-          <w:p>
-            <w:pPr>
-              <w:spacing w:after="60" w:before="60"/>
-            </w:pPr>
-            <w:r>
-              <w:rPr>
-                <w:b/>
-                <w:sz w:val="18"/>
-              </w:rPr>
-              <w:t>Lower prime p</w:t>
-            </w:r>
-          </w:p>
-        </w:tc>
-        <w:tc>
-          <w:tcPr>
-            <w:tcW w:type="dxa" w:w="720"/>
-            <w:shd w:fill="E6E6E6"/>
-          </w:tcPr>
-          <w:p>
-            <w:pPr>
-              <w:spacing w:after="60" w:before="60"/>
-            </w:pPr>
-            <w:r>
-              <w:rPr>
-                <w:b/>
-                <w:sz w:val="18"/>
-              </w:rPr>
-              <w:t>Gap</w:t>
-            </w:r>
-          </w:p>
-        </w:tc>
-        <w:tc>
-          <w:tcPr>
-            <w:tcW w:type="dxa" w:w="720"/>
-            <w:shd w:fill="E6E6E6"/>
-          </w:tcPr>
-          <w:p>
-            <w:pPr>
-              <w:spacing w:after="60" w:before="60"/>
-            </w:pPr>
-            <w:r>
-              <w:rPr>
-                <w:b/>
-                <w:sz w:val="18"/>
-              </w:rPr>
-              <w:t>M</w:t>
-            </w:r>
-          </w:p>
-        </w:tc>
-        <w:tc>
-          <w:tcPr>
-            <w:tcW w:type="dxa" w:w="720"/>
-            <w:shd w:fill="E6E6E6"/>
-          </w:tcPr>
-          <w:p>
-            <w:pPr>
-              <w:spacing w:after="60" w:before="60"/>
-            </w:pPr>
-            <w:r>
-              <w:rPr>
-                <w:b/>
-                <w:sz w:val="18"/>
-              </w:rPr>
-              <w:t>s</w:t>
-            </w:r>
-          </w:p>
-        </w:tc>
-        <w:tc>
-          <w:tcPr>
-            <w:tcW w:type="dxa" w:w="1512"/>
-            <w:shd w:fill="E6E6E6"/>
-          </w:tcPr>
-          <w:p>
-            <w:pPr>
-              <w:spacing w:after="60" w:before="60"/>
-            </w:pPr>
-            <w:r>
-              <w:rPr>
-                <w:b/>
-                <w:sz w:val="18"/>
-              </w:rPr>
-              <w:t>Skipped</w:t>
-            </w:r>
-          </w:p>
-        </w:tc>
-        <w:tc>
-          <w:tcPr>
-            <w:tcW w:type="dxa" w:w="936"/>
-            <w:shd w:fill="E6E6E6"/>
-          </w:tcPr>
-          <w:p>
-            <w:pPr>
-              <w:spacing w:after="60" w:before="60"/>
-            </w:pPr>
-            <w:r>
-              <w:rPr>
-                <w:b/>
-                <w:sz w:val="18"/>
-              </w:rPr>
-              <w:t>Status</w:t>
-            </w:r>
-          </w:p>
-        </w:tc>
-      </w:tr>
       <w:tr>
         <w:trPr>
           <w:cantSplit/>
@@ -15357,7 +15202,7 @@
         <w:keepNext/>
       </w:pPr>
       <w:r>
-        <w:t>Table A2. Sources and provenance. All external datasets accessed 13 September 2026.</w:t>
+        <w:t>Table A2. Sources and provenance. External snapshots accessed 13 September 2026; A000230 refreshed and the boundary rechecked on 14 September 2026.</w:t>
       </w:r>
     </w:p>
     <w:tbl>

</xml_diff>